<commit_message>
Livrable 2 — landing page autonome (site/index.html)
- Page unique, mobile d'abord, accessible (skip link, labels, aria-live,
  contrastes AA), 9 sections conformes au brief, formulaire Formspree
  ({{FORMSPREE_ENDPOINT}}) avec validation côté client et confirmation
  sans rechargement, JSON-LD Organization + Service, Open Graph,
  emplacements commentés pour Google Tag et conversion, aucun cookie
- Validée sans erreur (Nu HTML Checker, html-validate), Lighthouse mobile
  99/100/96/100, desktop 100/100/96/100, aucun débordement à 320 px
- generate.py : largeurs fixes de la liste à cocher, bloc de signatures
  insécable

Co-Authored-By: Claude Fable 5.1 <noreply@anthropic.com>
Claude-Session: https://claude.ai/code/session_01GNriugc5W7v9SCzgqVT7Aq
</commit_message>
<xml_diff>
--- a/juridique/mandat-administratif.docx
+++ b/juridique/mandat-administratif.docx
@@ -980,6 +980,7 @@
     </w:p>
     <w:p>
       <w:pPr>
+        <w:keepNext/>
         <w:spacing w:before="200"/>
       </w:pPr>
       <w:r>
@@ -998,12 +999,17 @@
         <w:gridCol w:w="4706"/>
       </w:tblGrid>
       <w:tr>
+        <w:trPr>
+          <w:cantSplit/>
+        </w:trPr>
         <w:tc>
           <w:tcPr>
             <w:tcW w:type="dxa" w:w="4706"/>
           </w:tcPr>
           <w:p>
             <w:pPr>
+              <w:keepNext/>
+              <w:keepLines/>
               <w:spacing w:after="40"/>
             </w:pPr>
             <w:r>
@@ -1015,6 +1021,8 @@
           </w:p>
           <w:p>
             <w:pPr>
+              <w:keepNext/>
+              <w:keepLines/>
               <w:spacing w:after="40"/>
             </w:pPr>
             <w:r>
@@ -1023,6 +1031,8 @@
           </w:p>
           <w:p>
             <w:pPr>
+              <w:keepNext/>
+              <w:keepLines/>
               <w:spacing w:after="40"/>
             </w:pPr>
             <w:r>
@@ -1034,6 +1044,8 @@
           </w:p>
           <w:p>
             <w:pPr>
+              <w:keepNext/>
+              <w:keepLines/>
               <w:spacing w:after="40"/>
             </w:pPr>
             <w:r>
@@ -1050,6 +1062,8 @@
           </w:tcPr>
           <w:p>
             <w:pPr>
+              <w:keepNext/>
+              <w:keepLines/>
               <w:spacing w:after="40"/>
             </w:pPr>
             <w:r>
@@ -1061,6 +1075,8 @@
           </w:p>
           <w:p>
             <w:pPr>
+              <w:keepNext/>
+              <w:keepLines/>
               <w:spacing w:after="40"/>
             </w:pPr>
             <w:r>
@@ -1069,6 +1085,8 @@
           </w:p>
           <w:p>
             <w:pPr>
+              <w:keepNext/>
+              <w:keepLines/>
               <w:spacing w:after="40"/>
             </w:pPr>
             <w:r>
@@ -1077,6 +1095,8 @@
           </w:p>
           <w:p>
             <w:pPr>
+              <w:keepNext/>
+              <w:keepLines/>
               <w:spacing w:after="40"/>
             </w:pPr>
             <w:r>
@@ -1089,6 +1109,9 @@
         </w:tc>
       </w:tr>
       <w:tr>
+        <w:trPr>
+          <w:cantSplit/>
+        </w:trPr>
         <w:tc>
           <w:tcPr>
             <w:tcW w:type="dxa" w:w="9412"/>
@@ -1096,6 +1119,7 @@
           </w:tcPr>
           <w:p>
             <w:pPr>
+              <w:keepLines/>
               <w:spacing w:after="40"/>
             </w:pPr>
             <w:r>
@@ -1107,6 +1131,7 @@
           </w:p>
           <w:p>
             <w:pPr>
+              <w:keepLines/>
               <w:spacing w:after="40"/>
             </w:pPr>
             <w:r>
@@ -1115,6 +1140,7 @@
           </w:p>
           <w:p>
             <w:pPr>
+              <w:keepLines/>
               <w:spacing w:after="40"/>
             </w:pPr>
             <w:r>
@@ -1123,6 +1149,7 @@
           </w:p>
           <w:p>
             <w:pPr>
+              <w:keepLines/>
               <w:spacing w:after="40"/>
             </w:pPr>
             <w:r>
@@ -1164,12 +1191,14 @@
         <w:tblStyle w:val="TableGrid"/>
         <w:tblW w:type="auto" w:w="0"/>
         <w:jc w:val="center"/>
+        <w:tblLayout w:type="fixed"/>
         <w:tblLook w:firstColumn="1" w:firstRow="1" w:lastColumn="0" w:lastRow="0" w:noHBand="0" w:noVBand="1" w:val="04A0"/>
+        <w:tblLayout w:type="fixed"/>
       </w:tblPr>
       <w:tblGrid>
-        <w:gridCol w:w="3137"/>
-        <w:gridCol w:w="3137"/>
-        <w:gridCol w:w="3137"/>
+        <w:gridCol w:w="567"/>
+        <w:gridCol w:w="5102"/>
+        <w:gridCol w:w="3742"/>
       </w:tblGrid>
       <w:tr>
         <w:tc>

</xml_diff>